<commit_message>
Clarify screenshot replacement for midterm report
</commit_message>
<xml_diff>
--- a/docs/defense/docx/3_Sinif_Proje_Raporu_YAZILIM_KTUN_TR.docx
+++ b/docs/defense/docx/3_Sinif_Proje_Raporu_YAZILIM_KTUN_TR.docx
@@ -1727,7 +1727,16 @@
     </w:p>
     <w:p>
       <w:r>
-        <w:t>Şekil 4. Nihai teslimden önce bu görsel, çalışan annotator ekranının gerçek ekran görüntüsü ile değiştirilmelidir. Görselde PDF viewer, vurgulanmış nutrient örneği, food item formu ve ilerleme alanı aynı karede görünmelidir.</w:t>
+        <w:t xml:space="preserve">Şekil 4. Nihai teslimden önce bu görsel, çalışan annotator ekranının gerçek ekran görüntüsü ile değiştirilmelidir. En pratik yol, </w:t>
+      </w:r>
+      <w:r>
+        <w:rPr>
+          <w:rFonts w:ascii="Courier New" w:hAnsi="Courier New" w:eastAsia="Courier New"/>
+        </w:rPr>
+        <w:t>docs/defense/assets/figure_4_annotator_placeholder.png</w:t>
+      </w:r>
+      <w:r>
+        <w:t xml:space="preserve"> dosyasını gerçek ekran görüntüsü ile aynı ad altında değiştirip export betiğini yeniden çalıştırmaktır. Görselde PDF viewer, vurgulanmış nutrient örneği, food item formu ve ilerleme alanı aynı karede görünmelidir.</w:t>
       </w:r>
     </w:p>
     <w:p>

</xml_diff>